<commit_message>
6.0.1: one searchable solution list in This environment
- One list (with its search) for both loading a solution as the model and checking the workbook against it;
  both buttons name the solution picked; the Default solution sits at the top of the list, for checking
- Guide: environment section and screenshots updated; Word guide rebuilt
- Page, solution zip (6_0_1_0) and XrmToolBox dll rebuilt as 6.0.1; 478 tests pass

Co-Authored-By: Claude Opus 5.5 <noreply@anthropic.com>
Claude-Session: https://claude.ai/code/session_01SKe3s5TvTWyeqUT38hd6Ss
</commit_message>
<xml_diff>
--- a/data-model-explorer-v6/docs/User_Guide.docx
+++ b/data-model-explorer-v6/docs/User_Guide.docx
@@ -45,7 +45,7 @@
         <w:t xml:space="preserve"> </w:t>
       </w:r>
       <w:r>
-        <w:t xml:space="preserve">6.0.0</w:t>
+        <w:t xml:space="preserve">6.0.1</w:t>
       </w:r>
       <w:r>
         <w:t xml:space="preserve"> </w:t>
@@ -7647,7 +7647,7 @@
         <w:rPr>
           <w:rStyle w:val="VerbatimChar"/>
         </w:rPr>
-        <w:t xml:space="preserve">FORMUS_DataModelExplorer_6_0_0_0.zip</w:t>
+        <w:t xml:space="preserve">FORMUS_DataModelExplorer_6_0_1_0.zip</w:t>
       </w:r>
       <w:r>
         <w:t xml:space="preserve"> </w:t>
@@ -8193,7 +8193,7 @@
       <w:r>
         <w:drawing>
           <wp:inline>
-            <wp:extent cx="3063240" cy="7318787"/>
+            <wp:extent cx="3172968" cy="4486088"/>
             <wp:effectExtent b="0" l="0" r="0" t="0"/>
             <wp:docPr descr="This environment" title="" id="84" name="Picture"/>
             <a:graphic>
@@ -8214,7 +8214,7 @@
                   <pic:spPr bwMode="auto">
                     <a:xfrm>
                       <a:off x="0" y="0"/>
-                      <a:ext cx="3063240" cy="7318787"/>
+                      <a:ext cx="3172968" cy="4486088"/>
                     </a:xfrm>
                     <a:prstGeom prst="rect">
                       <a:avLst/>
@@ -8288,7 +8288,7 @@
         <w:t xml:space="preserve"> </w:t>
       </w:r>
       <w:r>
-        <w:t xml:space="preserve">The solution to check against ·</w:t>
+        <w:t xml:space="preserve">Managed environment ·</w:t>
       </w:r>
       <w:r>
         <w:t xml:space="preserve"> </w:t>
@@ -8304,7 +8304,15 @@
         <w:t xml:space="preserve"> </w:t>
       </w:r>
       <w:r>
-        <w:t xml:space="preserve">Managed environment</w:t>
+        <w:t xml:space="preserve">Check the workbook against it</w:t>
+      </w:r>
+    </w:p>
+    <w:p>
+      <w:pPr>
+        <w:pStyle w:val="BodyText"/>
+      </w:pPr>
+      <w:r>
+        <w:t xml:space="preserve">There is one list of solutions, with a search box. Pick a solution once, then load it as the model or check the workbook against it: both buttons name the solution picked.</w:t>
       </w:r>
     </w:p>
     <w:bookmarkEnd w:id="86"/>
@@ -8465,23 +8473,7 @@
         <w:t xml:space="preserve">Environment</w:t>
       </w:r>
       <w:r>
-        <w:t xml:space="preserve">, and under</w:t>
-      </w:r>
-      <w:r>
-        <w:t xml:space="preserve"> </w:t>
-      </w:r>
-      <w:r>
-        <w:rPr>
-          <w:bCs/>
-          <w:b/>
-        </w:rPr>
-        <w:t xml:space="preserve">Check this workbook against the environment</w:t>
-      </w:r>
-      <w:r>
-        <w:t xml:space="preserve"> </w:t>
-      </w:r>
-      <w:r>
-        <w:t xml:space="preserve">pick what to compare with:</w:t>
+        <w:t xml:space="preserve">, and in the solution list pick what to compare with:</w:t>
       </w:r>
     </w:p>
     <w:p>
@@ -8519,7 +8511,10 @@
         <w:t xml:space="preserve">Default solution: the tables in this workbook</w:t>
       </w:r>
       <w:r>
-        <w:t xml:space="preserve">, which reads every table the workbook names, wherever it came from.</w:t>
+        <w:t xml:space="preserve"> </w:t>
+      </w:r>
+      <w:r>
+        <w:t xml:space="preserve">(at the top of the list), which reads every table the workbook names, wherever it came from.</w:t>
       </w:r>
     </w:p>
     <w:p>
@@ -8569,10 +8564,13 @@
           <w:bCs/>
           <w:b/>
         </w:rPr>
-        <w:t xml:space="preserve">Check</w:t>
-      </w:r>
-      <w:r>
-        <w:t xml:space="preserve">.</w:t>
+        <w:t xml:space="preserve">Check against …</w:t>
+      </w:r>
+      <w:r>
+        <w:t xml:space="preserve"> </w:t>
+      </w:r>
+      <w:r>
+        <w:t xml:space="preserve">(the button names the solution).</w:t>
       </w:r>
     </w:p>
     <w:p>

</xml_diff>